<commit_message>
Lisa NP1 kalendrikutsed — ühe klõpsuga meeldetuletused
- 6 igapäevast .ics faili + kombineeritud NP1-koik-meeldetuletused.ics
- Google Calendar ja Outlook ühe-klõpsu lingid DOCX-is
- Mobiilileht np1-calendar/index.html
- Genereerimine: scripts/loo_np1_kalender.py

Co-authored-by: reneealuste-commits <reneealuste-commits@users.noreply.github.com>
</commit_message>
<xml_diff>
--- a/Neurology-Protocol-Linnajuhend.docx
+++ b/Neurology-Protocol-Linnajuhend.docx
@@ -3511,6 +3511,782 @@
     </w:tbl>
     <w:p/>
     <w:p>
+      <w:r>
+        <w:br w:type="page"/>
+      </w:r>
+    </w:p>
+    <w:p>
+      <w:pPr>
+        <w:pStyle w:val="Heading1"/>
+      </w:pPr>
+      <w:r>
+        <w:rPr>
+          <w:color w:val="B71C1C"/>
+        </w:rPr>
+        <w:t>Kalendrikutsed — ühe klõpsuga</w:t>
+      </w:r>
+    </w:p>
+    <w:p>
+      <w:r>
+        <w:rPr>
+          <w:b w:val="0"/>
+          <w:sz w:val="20"/>
+        </w:rPr>
+        <w:t>Klõpsa lingil → kinnita kalendris → igapäevane meeldetuletus on olemas. Iga sündmus kordub iga päev; 10 min enne tuleb alarm.</w:t>
+      </w:r>
+    </w:p>
+    <w:p>
+      <w:pPr>
+        <w:pStyle w:val="Heading2"/>
+      </w:pPr>
+      <w:r>
+        <w:rPr>
+          <w:color w:val="1A1A2E"/>
+        </w:rPr>
+        <w:t>Google Calendar (telefon + arvuti)</w:t>
+      </w:r>
+    </w:p>
+    <w:p>
+      <w:r>
+        <w:rPr>
+          <w:b w:val="0"/>
+          <w:sz w:val="20"/>
+        </w:rPr>
+        <w:t>Soovitatav. Avab Google'i kalendri Lisa sündmus ekraani - vajuta Salvesta.</w:t>
+      </w:r>
+    </w:p>
+    <w:p>
+      <w:r>
+        <w:rPr>
+          <w:sz w:val="20"/>
+        </w:rPr>
+        <w:t xml:space="preserve">Mobiilileht — kõik nupud ühes kohas: </w:t>
+      </w:r>
+      <w:hyperlink r:id="rId46">
+        <w:r>
+          <w:rPr>
+            <w:color w:val="0563C1"/>
+            <w:u w:val="single"/>
+          </w:rPr>
+          <w:t>https://htmlpreview.github.io/?https://github.com/reneealuste-commits/Unpluged-Al/raw/main/np1-calendar/index.html</w:t>
+        </w:r>
+      </w:hyperlink>
+      <w:r>
+        <w:rPr>
+          <w:sz w:val="20"/>
+        </w:rPr>
+        <w:t xml:space="preserve">  —  ava telefonis, klõpsa sündmust</w:t>
+      </w:r>
+    </w:p>
+    <w:p>
+      <w:r>
+        <w:rPr>
+          <w:sz w:val="20"/>
+        </w:rPr>
+        <w:t xml:space="preserve">NP1 Hommik — MB, Mag, seened: </w:t>
+      </w:r>
+      <w:hyperlink r:id="rId47">
+        <w:r>
+          <w:rPr>
+            <w:color w:val="0563C1"/>
+            <w:u w:val="single"/>
+          </w:rPr>
+          <w:t>https://calendar.google.com/calendar/render?action=TEMPLATE&amp;text=NP1+Hommik+%E2%80%94+MB%2C+Mag%2C+seened&amp;dates=20260820T070000%2F20260820T073000&amp;details=NEUROLOGY+PROTOCOL+%E2%80%94+hommik%0A%E2%80%A2+Methylene+Blue+1+mg%2Fkg%0A%E2%80%A2+Neuro+Mag+%28Mg+L-Threonate%29+3%C3%97144+mg%0A%E2%80%A2+Lion%27s+Mane+2000+mg%0A%E2%80%A2+Turkey+Tail+2000+mg%0A%E2%80%A2+Nikotiin+%28vajadusel%29&amp;recur=RRULE%3AFREQ%3DDAILY&amp;ctz=Europe%2FTallinn</w:t>
+        </w:r>
+      </w:hyperlink>
+      <w:r>
+        <w:rPr>
+          <w:sz w:val="20"/>
+        </w:rPr>
+        <w:t xml:space="preserve">  —  → Lisa kalendrisse</w:t>
+      </w:r>
+    </w:p>
+    <w:p>
+      <w:r>
+        <w:rPr>
+          <w:sz w:val="20"/>
+        </w:rPr>
+        <w:t xml:space="preserve">NP1 Keskpäev — valgus + lisandid: </w:t>
+      </w:r>
+      <w:hyperlink r:id="rId48">
+        <w:r>
+          <w:rPr>
+            <w:color w:val="0563C1"/>
+            <w:u w:val="single"/>
+          </w:rPr>
+          <w:t>https://calendar.google.com/calendar/render?action=TEMPLATE&amp;text=NP1+Keskp%C3%A4ev+%E2%80%94+valgus+%2B+lisandid&amp;dates=20260820T123000%2F20260820T130000&amp;details=NEUROLOGY+PROTOCOL+%E2%80%94+keskp%C3%A4ev%0A%E2%80%A2+Punane+valgus+63+mW%2Fcm%C2%B2%2C+20+min%0A%E2%80%A2+Peet+3000+mg%0A%E2%80%A2+Omega-3+1280+mg%0A%E2%80%A2+P%C3%A4rm+1%E2%80%933+spl%0A%E2%80%A2+Kurkumiin+400+mg&amp;recur=RRULE%3AFREQ%3DDAILY&amp;ctz=Europe%2FTallinn</w:t>
+        </w:r>
+      </w:hyperlink>
+      <w:r>
+        <w:rPr>
+          <w:sz w:val="20"/>
+        </w:rPr>
+        <w:t xml:space="preserve">  —  → Lisa kalendrisse</w:t>
+      </w:r>
+    </w:p>
+    <w:p>
+      <w:r>
+        <w:rPr>
+          <w:sz w:val="20"/>
+        </w:rPr>
+        <w:t xml:space="preserve">NP1 Õhtu — 1 h looduses: </w:t>
+      </w:r>
+      <w:hyperlink r:id="rId49">
+        <w:r>
+          <w:rPr>
+            <w:color w:val="0563C1"/>
+            <w:u w:val="single"/>
+          </w:rPr>
+          <w:t>https://calendar.google.com/calendar/render?action=TEMPLATE&amp;text=NP1+%C3%95htu+%E2%80%94+1+h+looduses&amp;dates=20260820T173000%2F20260820T183000&amp;details=NEUROLOGY+PROTOCOL+%E2%80%94+loodus%0A%E2%80%A2+1+tund+looduses+%28mets%2C+park%2C+raba%29%0A%E2%80%A2+Tallinn%3A+P%C3%A4%C3%A4sk%C3%BCla+raba%2C+N%C3%B5mme%2C+Kadriorg&amp;recur=RRULE%3AFREQ%3DDAILY&amp;ctz=Europe%2FTallinn</w:t>
+        </w:r>
+      </w:hyperlink>
+      <w:r>
+        <w:rPr>
+          <w:sz w:val="20"/>
+        </w:rPr>
+        <w:t xml:space="preserve">  —  → Lisa kalendrisse</w:t>
+      </w:r>
+    </w:p>
+    <w:p>
+      <w:r>
+        <w:rPr>
+          <w:sz w:val="20"/>
+        </w:rPr>
+        <w:t xml:space="preserve">NP1 Loojang — melatoniin + glutatioon: </w:t>
+      </w:r>
+      <w:hyperlink r:id="rId50">
+        <w:r>
+          <w:rPr>
+            <w:color w:val="0563C1"/>
+            <w:u w:val="single"/>
+          </w:rPr>
+          <w:t>https://calendar.google.com/calendar/render?action=TEMPLATE&amp;text=NP1+Loojang+%E2%80%94+melatoniin+%2B+glutatioon&amp;dates=20260820T203000%2F20260820T204500&amp;details=NEUROLOGY+PROTOCOL+%E2%80%94+loojang%0A%E2%80%A2+Melatoniin+200+mg%0A%E2%80%A2+L-Glutathione+250+mg%0A%E2%80%A2+Kohanda+kellaaega+hooajaliselt&amp;recur=RRULE%3AFREQ%3DDAILY&amp;ctz=Europe%2FTallinn</w:t>
+        </w:r>
+      </w:hyperlink>
+      <w:r>
+        <w:rPr>
+          <w:sz w:val="20"/>
+        </w:rPr>
+        <w:t xml:space="preserve">  —  → Lisa kalendrisse</w:t>
+      </w:r>
+    </w:p>
+    <w:p>
+      <w:r>
+        <w:rPr>
+          <w:sz w:val="20"/>
+        </w:rPr>
+        <w:t xml:space="preserve">NP1 Meditatsioon 35 min: </w:t>
+      </w:r>
+      <w:hyperlink r:id="rId51">
+        <w:r>
+          <w:rPr>
+            <w:color w:val="0563C1"/>
+            <w:u w:val="single"/>
+          </w:rPr>
+          <w:t>https://calendar.google.com/calendar/render?action=TEMPLATE&amp;text=NP1+Meditatsioon+35+min&amp;dates=20260820T220000%2F20260820T223500&amp;details=NEUROLOGY+PROTOCOL+%E2%80%94+%C3%B6%C3%B6%0A%E2%80%A2+Meditatsioon+%2F+mindfulness+35+min%0A%E2%80%A2+Insight+Timer+v%C3%B5i+vaikus&amp;recur=RRULE%3AFREQ%3DDAILY&amp;ctz=Europe%2FTallinn</w:t>
+        </w:r>
+      </w:hyperlink>
+      <w:r>
+        <w:rPr>
+          <w:sz w:val="20"/>
+        </w:rPr>
+        <w:t xml:space="preserve">  —  → Lisa kalendrisse</w:t>
+      </w:r>
+    </w:p>
+    <w:p>
+      <w:r>
+        <w:rPr>
+          <w:sz w:val="20"/>
+        </w:rPr>
+        <w:t xml:space="preserve">NP1 Varahommik: </w:t>
+      </w:r>
+      <w:hyperlink r:id="rId52">
+        <w:r>
+          <w:rPr>
+            <w:color w:val="0563C1"/>
+            <w:u w:val="single"/>
+          </w:rPr>
+          <w:t>https://calendar.google.com/calendar/render?action=TEMPLATE&amp;text=NP1+Varahommik&amp;dates=20260820T053000%2F20260820T054500&amp;details=NEUROLOGY+PROTOCOL+%E2%80%94+varahommik+%28protokolli+j%C3%A4rgi%29&amp;recur=RRULE%3AFREQ%3DDAILY&amp;ctz=Europe%2FTallinn</w:t>
+        </w:r>
+      </w:hyperlink>
+      <w:r>
+        <w:rPr>
+          <w:sz w:val="20"/>
+        </w:rPr>
+        <w:t xml:space="preserve">  —  → Lisa kalendrisse</w:t>
+      </w:r>
+    </w:p>
+    <w:p>
+      <w:pPr>
+        <w:pStyle w:val="Heading2"/>
+      </w:pPr>
+      <w:r>
+        <w:rPr>
+          <w:color w:val="1A1A2E"/>
+        </w:rPr>
+        <w:t>Apple Calendar / Outlook (.ics fail)</w:t>
+      </w:r>
+    </w:p>
+    <w:p>
+      <w:r>
+        <w:rPr>
+          <w:b w:val="0"/>
+          <w:sz w:val="20"/>
+        </w:rPr>
+        <w:t>Laadi .ics alla, ava fail, vali Lisa kõik / Add to Calendar. Või impordi Outlookis.</w:t>
+      </w:r>
+    </w:p>
+    <w:p>
+      <w:r>
+        <w:rPr>
+          <w:sz w:val="20"/>
+        </w:rPr>
+        <w:t xml:space="preserve">KÕIK 6 meeldetuletust korraga: </w:t>
+      </w:r>
+      <w:hyperlink r:id="rId53">
+        <w:r>
+          <w:rPr>
+            <w:color w:val="0563C1"/>
+            <w:u w:val="single"/>
+          </w:rPr>
+          <w:t>https://github.com/reneealuste-commits/Unpluged-Al/raw/main/np1-calendar/NP1-koik-meeldetuletused.ics</w:t>
+        </w:r>
+      </w:hyperlink>
+      <w:r>
+        <w:rPr>
+          <w:sz w:val="20"/>
+        </w:rPr>
+        <w:t xml:space="preserve">  —  soovitatav — üks import</w:t>
+      </w:r>
+    </w:p>
+    <w:p>
+      <w:r>
+        <w:rPr>
+          <w:sz w:val="20"/>
+        </w:rPr>
+        <w:t xml:space="preserve">NP1 Hommik — MB, Mag, seened, nikotiin: </w:t>
+      </w:r>
+      <w:hyperlink r:id="rId54">
+        <w:r>
+          <w:rPr>
+            <w:color w:val="0563C1"/>
+            <w:u w:val="single"/>
+          </w:rPr>
+          <w:t>https://github.com/reneealuste-commits/Unpluged-Al/raw/main/np1-calendar/NP1-hommik.ics</w:t>
+        </w:r>
+      </w:hyperlink>
+    </w:p>
+    <w:p>
+      <w:r>
+        <w:rPr>
+          <w:sz w:val="20"/>
+        </w:rPr>
+        <w:t xml:space="preserve">NP1 Keskpäev — punane valgus + toidulisandid: </w:t>
+      </w:r>
+      <w:hyperlink r:id="rId55">
+        <w:r>
+          <w:rPr>
+            <w:color w:val="0563C1"/>
+            <w:u w:val="single"/>
+          </w:rPr>
+          <w:t>https://github.com/reneealuste-commits/Unpluged-Al/raw/main/np1-calendar/NP1-keskpaev.ics</w:t>
+        </w:r>
+      </w:hyperlink>
+    </w:p>
+    <w:p>
+      <w:r>
+        <w:rPr>
+          <w:sz w:val="20"/>
+        </w:rPr>
+        <w:t xml:space="preserve">NP1 Õhtu — 1 h looduses: </w:t>
+      </w:r>
+      <w:hyperlink r:id="rId56">
+        <w:r>
+          <w:rPr>
+            <w:color w:val="0563C1"/>
+            <w:u w:val="single"/>
+          </w:rPr>
+          <w:t>https://github.com/reneealuste-commits/Unpluged-Al/raw/main/np1-calendar/NP1-loodus.ics</w:t>
+        </w:r>
+      </w:hyperlink>
+    </w:p>
+    <w:p>
+      <w:r>
+        <w:rPr>
+          <w:sz w:val="20"/>
+        </w:rPr>
+        <w:t xml:space="preserve">NP1 Päikeseloojang — melatoniin + glutatioon: </w:t>
+      </w:r>
+      <w:hyperlink r:id="rId57">
+        <w:r>
+          <w:rPr>
+            <w:color w:val="0563C1"/>
+            <w:u w:val="single"/>
+          </w:rPr>
+          <w:t>https://github.com/reneealuste-commits/Unpluged-Al/raw/main/np1-calendar/NP1-loojang.ics</w:t>
+        </w:r>
+      </w:hyperlink>
+    </w:p>
+    <w:p>
+      <w:r>
+        <w:rPr>
+          <w:sz w:val="20"/>
+        </w:rPr>
+        <w:t xml:space="preserve">NP1 Öö — meditatsioon 35 min: </w:t>
+      </w:r>
+      <w:hyperlink r:id="rId58">
+        <w:r>
+          <w:rPr>
+            <w:color w:val="0563C1"/>
+            <w:u w:val="single"/>
+          </w:rPr>
+          <w:t>https://github.com/reneealuste-commits/Unpluged-Al/raw/main/np1-calendar/NP1-meditatsioon.ics</w:t>
+        </w:r>
+      </w:hyperlink>
+    </w:p>
+    <w:p>
+      <w:r>
+        <w:rPr>
+          <w:sz w:val="20"/>
+        </w:rPr>
+        <w:t xml:space="preserve">NP1 Varahommik — mikrodose: </w:t>
+      </w:r>
+      <w:hyperlink r:id="rId59">
+        <w:r>
+          <w:rPr>
+            <w:color w:val="0563C1"/>
+            <w:u w:val="single"/>
+          </w:rPr>
+          <w:t>https://github.com/reneealuste-commits/Unpluged-Al/raw/main/np1-calendar/NP1-varahommik.ics</w:t>
+        </w:r>
+      </w:hyperlink>
+    </w:p>
+    <w:p>
+      <w:pPr>
+        <w:pStyle w:val="Heading2"/>
+      </w:pPr>
+      <w:r>
+        <w:rPr>
+          <w:color w:val="1A1A2E"/>
+        </w:rPr>
+        <w:t>Outlook.com (veeb)</w:t>
+      </w:r>
+    </w:p>
+    <w:p>
+      <w:r>
+        <w:rPr>
+          <w:sz w:val="20"/>
+        </w:rPr>
+        <w:t xml:space="preserve">NP1 Hommik — MB, Mag, seened: </w:t>
+      </w:r>
+      <w:hyperlink r:id="rId60">
+        <w:r>
+          <w:rPr>
+            <w:color w:val="0563C1"/>
+            <w:u w:val="single"/>
+          </w:rPr>
+          <w:t>https://outlook.live.com/calendar/0/deeplink/compose?path=%2Fcalendar%2Faction%2Fcompose&amp;rru=addevent&amp;subject=NP1+Hommik+%E2%80%94+MB%2C+Mag%2C+seened&amp;startdt=2026-08-20T07%3A00%3A00&amp;enddt=2026-08-20T07%3A30%3A00&amp;body=NEUROLOGY+PROTOCOL+%E2%80%94+hommik%0A%E2%80%A2+Methylene+Blue+1+mg%2Fkg%0A%E2%80%A2+Neuro+Mag+%28Mg+L-Threonate%29+3%C3%97144+mg%0A%E2%80%A2+Lion%27s+Mane+2000+mg%0A%E2%80%A2+Turkey+Tail+2000+mg%0A%E2%80%A2+Nikotiin+%28vajadusel%29&amp;recurrence=daily</w:t>
+        </w:r>
+      </w:hyperlink>
+    </w:p>
+    <w:p>
+      <w:r>
+        <w:rPr>
+          <w:sz w:val="20"/>
+        </w:rPr>
+        <w:t xml:space="preserve">NP1 Keskpäev — valgus + lisandid: </w:t>
+      </w:r>
+      <w:hyperlink r:id="rId61">
+        <w:r>
+          <w:rPr>
+            <w:color w:val="0563C1"/>
+            <w:u w:val="single"/>
+          </w:rPr>
+          <w:t>https://outlook.live.com/calendar/0/deeplink/compose?path=%2Fcalendar%2Faction%2Fcompose&amp;rru=addevent&amp;subject=NP1+Keskp%C3%A4ev+%E2%80%94+valgus+%2B+lisandid&amp;startdt=2026-08-20T12%3A30%3A00&amp;enddt=2026-08-20T13%3A00%3A00&amp;body=NEUROLOGY+PROTOCOL+%E2%80%94+keskp%C3%A4ev%0A%E2%80%A2+Punane+valgus+63+mW%2Fcm%C2%B2%2C+20+min%0A%E2%80%A2+Peet+3000+mg%0A%E2%80%A2+Omega-3+1280+mg%0A%E2%80%A2+P%C3%A4rm+1%E2%80%933+spl%0A%E2%80%A2+Kurkumiin+400+mg&amp;recurrence=daily</w:t>
+        </w:r>
+      </w:hyperlink>
+    </w:p>
+    <w:p>
+      <w:r>
+        <w:rPr>
+          <w:sz w:val="20"/>
+        </w:rPr>
+        <w:t xml:space="preserve">NP1 Õhtu — 1 h looduses: </w:t>
+      </w:r>
+      <w:hyperlink r:id="rId62">
+        <w:r>
+          <w:rPr>
+            <w:color w:val="0563C1"/>
+            <w:u w:val="single"/>
+          </w:rPr>
+          <w:t>https://outlook.live.com/calendar/0/deeplink/compose?path=%2Fcalendar%2Faction%2Fcompose&amp;rru=addevent&amp;subject=NP1+%C3%95htu+%E2%80%94+1+h+looduses&amp;startdt=2026-08-20T17%3A30%3A00&amp;enddt=2026-08-20T18%3A30%3A00&amp;body=NEUROLOGY+PROTOCOL+%E2%80%94+loodus%0A%E2%80%A2+1+tund+looduses+%28mets%2C+park%2C+raba%29%0A%E2%80%A2+Tallinn%3A+P%C3%A4%C3%A4sk%C3%BCla+raba%2C+N%C3%B5mme%2C+Kadriorg&amp;recurrence=daily</w:t>
+        </w:r>
+      </w:hyperlink>
+    </w:p>
+    <w:p>
+      <w:r>
+        <w:rPr>
+          <w:sz w:val="20"/>
+        </w:rPr>
+        <w:t xml:space="preserve">NP1 Loojang — melatoniin + glutatioon: </w:t>
+      </w:r>
+      <w:hyperlink r:id="rId63">
+        <w:r>
+          <w:rPr>
+            <w:color w:val="0563C1"/>
+            <w:u w:val="single"/>
+          </w:rPr>
+          <w:t>https://outlook.live.com/calendar/0/deeplink/compose?path=%2Fcalendar%2Faction%2Fcompose&amp;rru=addevent&amp;subject=NP1+Loojang+%E2%80%94+melatoniin+%2B+glutatioon&amp;startdt=2026-08-20T20%3A30%3A00&amp;enddt=2026-08-20T20%3A45%3A00&amp;body=NEUROLOGY+PROTOCOL+%E2%80%94+loojang%0A%E2%80%A2+Melatoniin+200+mg%0A%E2%80%A2+L-Glutathione+250+mg%0A%E2%80%A2+Kohanda+kellaaega+hooajaliselt&amp;recurrence=daily</w:t>
+        </w:r>
+      </w:hyperlink>
+    </w:p>
+    <w:p>
+      <w:r>
+        <w:rPr>
+          <w:sz w:val="20"/>
+        </w:rPr>
+        <w:t xml:space="preserve">NP1 Meditatsioon 35 min: </w:t>
+      </w:r>
+      <w:hyperlink r:id="rId64">
+        <w:r>
+          <w:rPr>
+            <w:color w:val="0563C1"/>
+            <w:u w:val="single"/>
+          </w:rPr>
+          <w:t>https://outlook.live.com/calendar/0/deeplink/compose?path=%2Fcalendar%2Faction%2Fcompose&amp;rru=addevent&amp;subject=NP1+Meditatsioon+35+min&amp;startdt=2026-08-20T22%3A00%3A00&amp;enddt=2026-08-20T22%3A35%3A00&amp;body=NEUROLOGY+PROTOCOL+%E2%80%94+%C3%B6%C3%B6%0A%E2%80%A2+Meditatsioon+%2F+mindfulness+35+min%0A%E2%80%A2+Insight+Timer+v%C3%B5i+vaikus&amp;recurrence=daily</w:t>
+        </w:r>
+      </w:hyperlink>
+    </w:p>
+    <w:p>
+      <w:r>
+        <w:rPr>
+          <w:sz w:val="20"/>
+        </w:rPr>
+        <w:t xml:space="preserve">NP1 Varahommik: </w:t>
+      </w:r>
+      <w:hyperlink r:id="rId65">
+        <w:r>
+          <w:rPr>
+            <w:color w:val="0563C1"/>
+            <w:u w:val="single"/>
+          </w:rPr>
+          <w:t>https://outlook.live.com/calendar/0/deeplink/compose?path=%2Fcalendar%2Faction%2Fcompose&amp;rru=addevent&amp;subject=NP1+Varahommik&amp;startdt=2026-08-20T05%3A30%3A00&amp;enddt=2026-08-20T05%3A45%3A00&amp;body=NEUROLOGY+PROTOCOL+%E2%80%94+varahommik+%28protokolli+j%C3%A4rgi%29&amp;recurrence=daily</w:t>
+        </w:r>
+      </w:hyperlink>
+    </w:p>
+    <w:tbl>
+      <w:tblPr>
+        <w:tblStyle w:val="TableGrid"/>
+        <w:tblW w:type="auto" w:w="0"/>
+        <w:tblLook w:firstColumn="1" w:firstRow="1" w:lastColumn="0" w:lastRow="0" w:noHBand="0" w:noVBand="1" w:val="04A0"/>
+      </w:tblPr>
+      <w:tblGrid>
+        <w:gridCol w:w="3135"/>
+        <w:gridCol w:w="3135"/>
+        <w:gridCol w:w="3135"/>
+      </w:tblGrid>
+      <w:tr>
+        <w:tc>
+          <w:tcPr>
+            <w:tcW w:type="dxa" w:w="3135"/>
+          </w:tcPr>
+          <w:p>
+            <w:r>
+              <w:rPr>
+                <w:b/>
+                <w:sz w:val="20"/>
+              </w:rPr>
+              <w:t>Aeg</w:t>
+            </w:r>
+          </w:p>
+        </w:tc>
+        <w:tc>
+          <w:tcPr>
+            <w:tcW w:type="dxa" w:w="3135"/>
+          </w:tcPr>
+          <w:p>
+            <w:r>
+              <w:rPr>
+                <w:b/>
+                <w:sz w:val="20"/>
+              </w:rPr>
+              <w:t>Sündmus</w:t>
+            </w:r>
+          </w:p>
+        </w:tc>
+        <w:tc>
+          <w:tcPr>
+            <w:tcW w:type="dxa" w:w="3135"/>
+          </w:tcPr>
+          <w:p>
+            <w:r>
+              <w:rPr>
+                <w:b/>
+                <w:sz w:val="20"/>
+              </w:rPr>
+              <w:t>Kestus</w:t>
+            </w:r>
+          </w:p>
+        </w:tc>
+      </w:tr>
+      <w:tr>
+        <w:tc>
+          <w:tcPr>
+            <w:tcW w:type="dxa" w:w="3135"/>
+          </w:tcPr>
+          <w:p>
+            <w:r>
+              <w:rPr>
+                <w:sz w:val="20"/>
+              </w:rPr>
+              <w:t>07:00</w:t>
+            </w:r>
+          </w:p>
+        </w:tc>
+        <w:tc>
+          <w:tcPr>
+            <w:tcW w:type="dxa" w:w="3135"/>
+          </w:tcPr>
+          <w:p>
+            <w:r>
+              <w:rPr>
+                <w:sz w:val="20"/>
+              </w:rPr>
+              <w:t>Hommik — MB, Mag, seened, nikotiin</w:t>
+            </w:r>
+          </w:p>
+        </w:tc>
+        <w:tc>
+          <w:tcPr>
+            <w:tcW w:type="dxa" w:w="3135"/>
+          </w:tcPr>
+          <w:p>
+            <w:r>
+              <w:rPr>
+                <w:sz w:val="20"/>
+              </w:rPr>
+              <w:t>30 min</w:t>
+            </w:r>
+          </w:p>
+        </w:tc>
+      </w:tr>
+      <w:tr>
+        <w:tc>
+          <w:tcPr>
+            <w:tcW w:type="dxa" w:w="3135"/>
+          </w:tcPr>
+          <w:p>
+            <w:r>
+              <w:rPr>
+                <w:sz w:val="20"/>
+              </w:rPr>
+              <w:t>12:30</w:t>
+            </w:r>
+          </w:p>
+        </w:tc>
+        <w:tc>
+          <w:tcPr>
+            <w:tcW w:type="dxa" w:w="3135"/>
+          </w:tcPr>
+          <w:p>
+            <w:r>
+              <w:rPr>
+                <w:sz w:val="20"/>
+              </w:rPr>
+              <w:t>Keskpäev — punane valgus + lisandid</w:t>
+            </w:r>
+          </w:p>
+        </w:tc>
+        <w:tc>
+          <w:tcPr>
+            <w:tcW w:type="dxa" w:w="3135"/>
+          </w:tcPr>
+          <w:p>
+            <w:r>
+              <w:rPr>
+                <w:sz w:val="20"/>
+              </w:rPr>
+              <w:t>30 min</w:t>
+            </w:r>
+          </w:p>
+        </w:tc>
+      </w:tr>
+      <w:tr>
+        <w:tc>
+          <w:tcPr>
+            <w:tcW w:type="dxa" w:w="3135"/>
+          </w:tcPr>
+          <w:p>
+            <w:r>
+              <w:rPr>
+                <w:sz w:val="20"/>
+              </w:rPr>
+              <w:t>17:30</w:t>
+            </w:r>
+          </w:p>
+        </w:tc>
+        <w:tc>
+          <w:tcPr>
+            <w:tcW w:type="dxa" w:w="3135"/>
+          </w:tcPr>
+          <w:p>
+            <w:r>
+              <w:rPr>
+                <w:sz w:val="20"/>
+              </w:rPr>
+              <w:t>Õhtu — 1 h looduses</w:t>
+            </w:r>
+          </w:p>
+        </w:tc>
+        <w:tc>
+          <w:tcPr>
+            <w:tcW w:type="dxa" w:w="3135"/>
+          </w:tcPr>
+          <w:p>
+            <w:r>
+              <w:rPr>
+                <w:sz w:val="20"/>
+              </w:rPr>
+              <w:t>60 min</w:t>
+            </w:r>
+          </w:p>
+        </w:tc>
+      </w:tr>
+      <w:tr>
+        <w:tc>
+          <w:tcPr>
+            <w:tcW w:type="dxa" w:w="3135"/>
+          </w:tcPr>
+          <w:p>
+            <w:r>
+              <w:rPr>
+                <w:sz w:val="20"/>
+              </w:rPr>
+              <w:t>20:30</w:t>
+            </w:r>
+          </w:p>
+        </w:tc>
+        <w:tc>
+          <w:tcPr>
+            <w:tcW w:type="dxa" w:w="3135"/>
+          </w:tcPr>
+          <w:p>
+            <w:r>
+              <w:rPr>
+                <w:sz w:val="20"/>
+              </w:rPr>
+              <w:t>Loojang — melatoniin + glutatioon</w:t>
+            </w:r>
+          </w:p>
+        </w:tc>
+        <w:tc>
+          <w:tcPr>
+            <w:tcW w:type="dxa" w:w="3135"/>
+          </w:tcPr>
+          <w:p>
+            <w:r>
+              <w:rPr>
+                <w:sz w:val="20"/>
+              </w:rPr>
+              <w:t>15 min</w:t>
+            </w:r>
+          </w:p>
+        </w:tc>
+      </w:tr>
+      <w:tr>
+        <w:tc>
+          <w:tcPr>
+            <w:tcW w:type="dxa" w:w="3135"/>
+          </w:tcPr>
+          <w:p>
+            <w:r>
+              <w:rPr>
+                <w:sz w:val="20"/>
+              </w:rPr>
+              <w:t>22:00</w:t>
+            </w:r>
+          </w:p>
+        </w:tc>
+        <w:tc>
+          <w:tcPr>
+            <w:tcW w:type="dxa" w:w="3135"/>
+          </w:tcPr>
+          <w:p>
+            <w:r>
+              <w:rPr>
+                <w:sz w:val="20"/>
+              </w:rPr>
+              <w:t>Öö — meditatsioon 35 min</w:t>
+            </w:r>
+          </w:p>
+        </w:tc>
+        <w:tc>
+          <w:tcPr>
+            <w:tcW w:type="dxa" w:w="3135"/>
+          </w:tcPr>
+          <w:p>
+            <w:r>
+              <w:rPr>
+                <w:sz w:val="20"/>
+              </w:rPr>
+              <w:t>35 min</w:t>
+            </w:r>
+          </w:p>
+        </w:tc>
+      </w:tr>
+      <w:tr>
+        <w:tc>
+          <w:tcPr>
+            <w:tcW w:type="dxa" w:w="3135"/>
+          </w:tcPr>
+          <w:p>
+            <w:r>
+              <w:rPr>
+                <w:sz w:val="20"/>
+              </w:rPr>
+              <w:t>05:30</w:t>
+            </w:r>
+          </w:p>
+        </w:tc>
+        <w:tc>
+          <w:tcPr>
+            <w:tcW w:type="dxa" w:w="3135"/>
+          </w:tcPr>
+          <w:p>
+            <w:r>
+              <w:rPr>
+                <w:sz w:val="20"/>
+              </w:rPr>
+              <w:t>Varahommik</w:t>
+            </w:r>
+          </w:p>
+        </w:tc>
+        <w:tc>
+          <w:tcPr>
+            <w:tcW w:type="dxa" w:w="3135"/>
+          </w:tcPr>
+          <w:p>
+            <w:r>
+              <w:rPr>
+                <w:sz w:val="20"/>
+              </w:rPr>
+              <w:t>15 min</w:t>
+            </w:r>
+          </w:p>
+        </w:tc>
+      </w:tr>
+    </w:tbl>
+    <w:p/>
+    <w:p>
+      <w:r>
+        <w:rPr>
+          <w:b w:val="0"/>
+          <w:sz w:val="20"/>
+        </w:rPr>
+        <w:t>Kohanda kellaaegu oma rütmi järgi. Loojangu aega (20:30) muuda hooajaliselt.</w:t>
+      </w:r>
+    </w:p>
+    <w:p>
       <w:pPr>
         <w:pStyle w:val="Heading1"/>
       </w:pPr>

</xml_diff>